<commit_message>
WhiteBoard Update - 2026-04-26 17:10:36
</commit_message>
<xml_diff>
--- a/A2_Kinder/01_FamilieAlltag/01_FamilieErzaehlen/A2_Kinder_FamilieAlltag_01_FamilieErzaehlen_Konversation.docx
+++ b/A2_Kinder/01_FamilieAlltag/01_FamilieErzaehlen/A2_Kinder_FamilieAlltag_01_FamilieErzaehlen_Konversation.docx
@@ -101,29 +101,7 @@
           <w:sz w:val="36"/>
           <w:szCs w:val="36"/>
         </w:rPr>
-        <w:t>Konversation: Familie erz</w:t>
-      </w:r>
-      <w:r>
-        <w:rPr>
-          <w:rFonts w:eastAsia="Arial" w:cs="Arial" w:ascii="Arial" w:hAnsi="Arial"/>
-          <w:b/>
-          <w:bCs/>
-          <w:color w:val="1F4E79"/>
-          <w:sz w:val="36"/>
-          <w:szCs w:val="36"/>
-        </w:rPr>
-        <w:t>ä</w:t>
-      </w:r>
-      <w:r>
-        <w:rPr>
-          <w:rFonts w:eastAsia="Arial" w:cs="Arial" w:ascii="Arial" w:hAnsi="Arial"/>
-          <w:b/>
-          <w:bCs/>
-          <w:color w:val="1F4E79"/>
-          <w:sz w:val="36"/>
-          <w:szCs w:val="36"/>
-        </w:rPr>
-        <w:t>hlen</w:t>
+        <w:t>Konversation: Familie erzählen</w:t>
       </w:r>
     </w:p>
     <w:p>
@@ -167,7 +145,7 @@
           <w:sz w:val="28"/>
           <w:szCs w:val="28"/>
         </w:rPr>
-        <w:t>Dialogger</w:t>
+        <w:t>Dialoggerüst 1: Ne</w:t>
       </w:r>
       <w:r>
         <w:rPr>
@@ -178,7 +156,7 @@
           <w:sz w:val="28"/>
           <w:szCs w:val="28"/>
         </w:rPr>
-        <w:t>ü</w:t>
+        <w:t>u</w:t>
       </w:r>
       <w:r>
         <w:rPr>
@@ -189,7 +167,7 @@
           <w:sz w:val="28"/>
           <w:szCs w:val="28"/>
         </w:rPr>
-        <w:t>st 1: Neue Mitsch</w:t>
+        <w:t xml:space="preserve"> Mitschülerin / n</w:t>
       </w:r>
       <w:r>
         <w:rPr>
@@ -200,7 +178,7 @@
           <w:sz w:val="28"/>
           <w:szCs w:val="28"/>
         </w:rPr>
-        <w:t>ü</w:t>
+        <w:t>eu</w:t>
       </w:r>
       <w:r>
         <w:rPr>
@@ -211,8 +189,215 @@
           <w:sz w:val="28"/>
           <w:szCs w:val="28"/>
         </w:rPr>
-        <w:t>lerin / neuer Mitsch</w:t>
-      </w:r>
+        <w:t>r Mitschüler</w:t>
+      </w:r>
+    </w:p>
+    <w:p>
+      <w:pPr>
+        <w:pStyle w:val="Normal"/>
+        <w:spacing w:before="80" w:after="80"/>
+        <w:rPr/>
+      </w:pPr>
+      <w:r>
+        <w:rPr>
+          <w:rFonts w:eastAsia="Arial" w:cs="Arial" w:ascii="Arial" w:hAnsi="Arial"/>
+          <w:sz w:val="24"/>
+          <w:szCs w:val="24"/>
+        </w:rPr>
+        <w:t>Stell dir vor, ein n</w:t>
+      </w:r>
+      <w:r>
+        <w:rPr>
+          <w:rFonts w:eastAsia="Arial" w:cs="Arial" w:ascii="Arial" w:hAnsi="Arial"/>
+          <w:sz w:val="24"/>
+          <w:szCs w:val="24"/>
+        </w:rPr>
+        <w:t>eue</w:t>
+      </w:r>
+      <w:r>
+        <w:rPr>
+          <w:rFonts w:eastAsia="Arial" w:cs="Arial" w:ascii="Arial" w:hAnsi="Arial"/>
+          <w:sz w:val="24"/>
+          <w:szCs w:val="24"/>
+        </w:rPr>
+        <w:t>s Kind ist in deiner Klasse. Ihr lernt euch kennen.</w:t>
+      </w:r>
+    </w:p>
+    <w:p>
+      <w:pPr>
+        <w:pStyle w:val="Normal"/>
+        <w:rPr/>
+      </w:pPr>
+      <w:r>
+        <w:rPr/>
+      </w:r>
+    </w:p>
+    <w:p>
+      <w:pPr>
+        <w:pStyle w:val="Normal"/>
+        <w:spacing w:before="80" w:after="80"/>
+        <w:rPr/>
+      </w:pPr>
+      <w:r>
+        <w:rPr>
+          <w:rFonts w:eastAsia="Arial" w:cs="Arial" w:ascii="Arial" w:hAnsi="Arial"/>
+          <w:sz w:val="24"/>
+          <w:szCs w:val="24"/>
+        </w:rPr>
+        <w:t>A:  Hi! Ich bin neu hier. Erzähl mir von deiner Familie.</w:t>
+      </w:r>
+    </w:p>
+    <w:p>
+      <w:pPr>
+        <w:pStyle w:val="Normal"/>
+        <w:spacing w:before="80" w:after="80"/>
+        <w:rPr/>
+      </w:pPr>
+      <w:r>
+        <w:rPr>
+          <w:rFonts w:eastAsia="Arial" w:cs="Arial" w:ascii="Arial" w:hAnsi="Arial"/>
+          <w:sz w:val="24"/>
+          <w:szCs w:val="24"/>
+        </w:rPr>
+        <w:t>B:  Klar! Wir sind ______________ Personen. Meine Mutter heisst ______________.</w:t>
+      </w:r>
+    </w:p>
+    <w:p>
+      <w:pPr>
+        <w:pStyle w:val="Normal"/>
+        <w:spacing w:before="80" w:after="80"/>
+        <w:rPr/>
+      </w:pPr>
+      <w:r>
+        <w:rPr>
+          <w:rFonts w:eastAsia="Arial" w:cs="Arial" w:ascii="Arial" w:hAnsi="Arial"/>
+          <w:sz w:val="24"/>
+          <w:szCs w:val="24"/>
+        </w:rPr>
+        <w:t>A:  Hast du Geschwister?</w:t>
+      </w:r>
+    </w:p>
+    <w:p>
+      <w:pPr>
+        <w:pStyle w:val="Normal"/>
+        <w:spacing w:before="80" w:after="80"/>
+        <w:rPr/>
+      </w:pPr>
+      <w:r>
+        <w:rPr>
+          <w:rFonts w:eastAsia="Arial" w:cs="Arial" w:ascii="Arial" w:hAnsi="Arial"/>
+          <w:sz w:val="24"/>
+          <w:szCs w:val="24"/>
+        </w:rPr>
+        <w:t>B:  Ja, ich habe ______________. Er/Sie ist ______________ Jahre alt.</w:t>
+      </w:r>
+    </w:p>
+    <w:p>
+      <w:pPr>
+        <w:pStyle w:val="Normal"/>
+        <w:spacing w:before="80" w:after="80"/>
+        <w:rPr/>
+      </w:pPr>
+      <w:r>
+        <w:rPr>
+          <w:rFonts w:eastAsia="Arial" w:cs="Arial" w:ascii="Arial" w:hAnsi="Arial"/>
+          <w:sz w:val="24"/>
+          <w:szCs w:val="24"/>
+        </w:rPr>
+        <w:t>A:  Was machst du am Wochenende mit deiner Familie?</w:t>
+      </w:r>
+    </w:p>
+    <w:p>
+      <w:pPr>
+        <w:pStyle w:val="Normal"/>
+        <w:spacing w:before="80" w:after="80"/>
+        <w:rPr/>
+      </w:pPr>
+      <w:r>
+        <w:rPr>
+          <w:rFonts w:eastAsia="Arial" w:cs="Arial" w:ascii="Arial" w:hAnsi="Arial"/>
+          <w:sz w:val="24"/>
+          <w:szCs w:val="24"/>
+        </w:rPr>
+        <w:t>B:  Wir machen oft ______________________. Manchmal ______________________.</w:t>
+      </w:r>
+    </w:p>
+    <w:p>
+      <w:pPr>
+        <w:pStyle w:val="Normal"/>
+        <w:spacing w:before="80" w:after="80"/>
+        <w:rPr/>
+      </w:pPr>
+      <w:r>
+        <w:rPr>
+          <w:rFonts w:eastAsia="Arial" w:cs="Arial" w:ascii="Arial" w:hAnsi="Arial"/>
+          <w:sz w:val="24"/>
+          <w:szCs w:val="24"/>
+        </w:rPr>
+        <w:t>A:  Das klingt schön!</w:t>
+      </w:r>
+    </w:p>
+    <w:p>
+      <w:pPr>
+        <w:pStyle w:val="Normal"/>
+        <w:rPr/>
+      </w:pPr>
+      <w:r>
+        <w:rPr/>
+      </w:r>
+    </w:p>
+    <w:p>
+      <w:pPr>
+        <w:pStyle w:val="Normal"/>
+        <w:spacing w:before="80" w:after="80"/>
+        <w:rPr/>
+      </w:pPr>
+      <w:r>
+        <w:rPr>
+          <w:rFonts w:eastAsia="Arial" w:cs="Arial" w:ascii="Arial" w:hAnsi="Arial"/>
+          <w:b/>
+          <w:bCs/>
+          <w:sz w:val="24"/>
+          <w:szCs w:val="24"/>
+        </w:rPr>
+        <w:t xml:space="preserve">Rollentausch! </w:t>
+      </w:r>
+      <w:r>
+        <w:rPr>
+          <w:rFonts w:eastAsia="Arial" w:cs="Arial" w:ascii="Arial" w:hAnsi="Arial"/>
+          <w:b/>
+          <w:bCs/>
+          <w:sz w:val="24"/>
+          <w:szCs w:val="24"/>
+        </w:rPr>
+        <w:t>Ü</w:t>
+      </w:r>
+      <w:r>
+        <w:rPr>
+          <w:rFonts w:eastAsia="Arial" w:cs="Arial" w:ascii="Arial" w:hAnsi="Arial"/>
+          <w:b/>
+          <w:bCs/>
+          <w:sz w:val="24"/>
+          <w:szCs w:val="24"/>
+        </w:rPr>
+        <w:t>bt noch einmal.</w:t>
+      </w:r>
+    </w:p>
+    <w:p>
+      <w:pPr>
+        <w:pStyle w:val="Normal"/>
+        <w:rPr/>
+      </w:pPr>
+      <w:r>
+        <w:rPr/>
+      </w:r>
+    </w:p>
+    <w:p>
+      <w:pPr>
+        <w:pStyle w:val="Normal"/>
+        <w:spacing w:before="200" w:after="80"/>
+        <w:rPr/>
+      </w:pPr>
       <w:r>
         <w:rPr>
           <w:rFonts w:eastAsia="Arial" w:cs="Arial" w:ascii="Arial" w:hAnsi="Arial"/>
@@ -222,8 +407,161 @@
           <w:sz w:val="28"/>
           <w:szCs w:val="28"/>
         </w:rPr>
-        <w:t>ü</w:t>
-      </w:r>
+        <w:t>Dialoggerüst 2: Verwandtenbesuch</w:t>
+      </w:r>
+    </w:p>
+    <w:p>
+      <w:pPr>
+        <w:pStyle w:val="Normal"/>
+        <w:rPr/>
+      </w:pPr>
+      <w:r>
+        <w:rPr/>
+      </w:r>
+    </w:p>
+    <w:p>
+      <w:pPr>
+        <w:pStyle w:val="Normal"/>
+        <w:spacing w:before="80" w:after="80"/>
+        <w:rPr/>
+      </w:pPr>
+      <w:r>
+        <w:rPr>
+          <w:rFonts w:eastAsia="Arial" w:cs="Arial" w:ascii="Arial" w:hAnsi="Arial"/>
+          <w:sz w:val="24"/>
+          <w:szCs w:val="24"/>
+        </w:rPr>
+        <w:t>A:  Wo warst du am Wochenende?</w:t>
+      </w:r>
+    </w:p>
+    <w:p>
+      <w:pPr>
+        <w:pStyle w:val="Normal"/>
+        <w:spacing w:before="80" w:after="80"/>
+        <w:rPr/>
+      </w:pPr>
+      <w:r>
+        <w:rPr>
+          <w:rFonts w:eastAsia="Arial" w:cs="Arial" w:ascii="Arial" w:hAnsi="Arial"/>
+          <w:sz w:val="24"/>
+          <w:szCs w:val="24"/>
+        </w:rPr>
+        <w:t>B:  Ich war bei ______________________.</w:t>
+      </w:r>
+    </w:p>
+    <w:p>
+      <w:pPr>
+        <w:pStyle w:val="Normal"/>
+        <w:spacing w:before="80" w:after="80"/>
+        <w:rPr/>
+      </w:pPr>
+      <w:r>
+        <w:rPr>
+          <w:rFonts w:eastAsia="Arial" w:cs="Arial" w:ascii="Arial" w:hAnsi="Arial"/>
+          <w:sz w:val="24"/>
+          <w:szCs w:val="24"/>
+        </w:rPr>
+        <w:t>A:  Was habt ihr gemacht?</w:t>
+      </w:r>
+    </w:p>
+    <w:p>
+      <w:pPr>
+        <w:pStyle w:val="Normal"/>
+        <w:spacing w:before="80" w:after="80"/>
+        <w:rPr/>
+      </w:pPr>
+      <w:r>
+        <w:rPr>
+          <w:rFonts w:eastAsia="Arial" w:cs="Arial" w:ascii="Arial" w:hAnsi="Arial"/>
+          <w:sz w:val="24"/>
+          <w:szCs w:val="24"/>
+        </w:rPr>
+        <w:t>B:  Wir haben ______________________ und ______________________.</w:t>
+      </w:r>
+    </w:p>
+    <w:p>
+      <w:pPr>
+        <w:pStyle w:val="Normal"/>
+        <w:spacing w:before="80" w:after="80"/>
+        <w:rPr/>
+      </w:pPr>
+      <w:r>
+        <w:rPr>
+          <w:rFonts w:eastAsia="Arial" w:cs="Arial" w:ascii="Arial" w:hAnsi="Arial"/>
+          <w:sz w:val="24"/>
+          <w:szCs w:val="24"/>
+        </w:rPr>
+        <w:t>A:  Hat es dir gefallen?</w:t>
+      </w:r>
+    </w:p>
+    <w:p>
+      <w:pPr>
+        <w:pStyle w:val="Normal"/>
+        <w:spacing w:before="80" w:after="80"/>
+        <w:rPr/>
+      </w:pPr>
+      <w:r>
+        <w:rPr>
+          <w:rFonts w:eastAsia="Arial" w:cs="Arial" w:ascii="Arial" w:hAnsi="Arial"/>
+          <w:sz w:val="24"/>
+          <w:szCs w:val="24"/>
+        </w:rPr>
+        <w:t>B:  Ja, sehr! / Nicht so, weil ______________________.</w:t>
+      </w:r>
+    </w:p>
+    <w:p>
+      <w:pPr>
+        <w:pStyle w:val="Normal"/>
+        <w:rPr/>
+      </w:pPr>
+      <w:r>
+        <w:rPr/>
+      </w:r>
+    </w:p>
+    <w:p>
+      <w:pPr>
+        <w:pStyle w:val="Normal"/>
+        <w:spacing w:before="80" w:after="80"/>
+        <w:rPr/>
+      </w:pPr>
+      <w:r>
+        <w:rPr>
+          <w:rFonts w:eastAsia="Arial" w:cs="Arial" w:ascii="Arial" w:hAnsi="Arial"/>
+          <w:b/>
+          <w:bCs/>
+          <w:sz w:val="24"/>
+          <w:szCs w:val="24"/>
+        </w:rPr>
+        <w:t>Rollentausch!</w:t>
+      </w:r>
+    </w:p>
+    <w:p>
+      <w:pPr>
+        <w:pStyle w:val="Normal"/>
+        <w:rPr/>
+      </w:pPr>
+      <w:r>
+        <w:rPr/>
+      </w:r>
+    </w:p>
+    <w:p>
+      <w:pPr>
+        <w:pStyle w:val="Normal"/>
+        <w:rPr/>
+      </w:pPr>
+      <w:r>
+        <w:rPr/>
+      </w:r>
+      <w:r>
+        <w:br w:type="page"/>
+      </w:r>
+    </w:p>
+    <w:p>
+      <w:pPr>
+        <w:pStyle w:val="Normal"/>
+        <w:spacing w:before="0" w:after="80"/>
+        <w:rPr/>
+      </w:pPr>
       <w:r>
         <w:rPr>
           <w:rFonts w:eastAsia="Arial" w:cs="Arial" w:ascii="Arial" w:hAnsi="Arial"/>
@@ -233,178 +571,192 @@
           <w:sz w:val="28"/>
           <w:szCs w:val="28"/>
         </w:rPr>
-        <w:t>ler</w:t>
-      </w:r>
-    </w:p>
-    <w:p>
-      <w:pPr>
-        <w:pStyle w:val="Normal"/>
-        <w:spacing w:before="80" w:after="80"/>
-        <w:rPr/>
-      </w:pPr>
-      <w:r>
-        <w:rPr>
-          <w:rFonts w:eastAsia="Arial" w:cs="Arial" w:ascii="Arial" w:hAnsi="Arial"/>
-          <w:sz w:val="24"/>
-          <w:szCs w:val="24"/>
-        </w:rPr>
-        <w:t>Stell dir vor, ein neues Kind ist in deiner Klasse. Ihr lernt euch kennen.</w:t>
-      </w:r>
-    </w:p>
-    <w:p>
-      <w:pPr>
-        <w:pStyle w:val="Normal"/>
-        <w:rPr/>
-      </w:pPr>
-      <w:r>
-        <w:rPr/>
-      </w:r>
-    </w:p>
-    <w:p>
-      <w:pPr>
-        <w:pStyle w:val="Normal"/>
-        <w:spacing w:before="80" w:after="80"/>
-        <w:rPr/>
-      </w:pPr>
-      <w:r>
-        <w:rPr>
-          <w:rFonts w:eastAsia="Arial" w:cs="Arial" w:ascii="Arial" w:hAnsi="Arial"/>
-          <w:sz w:val="24"/>
-          <w:szCs w:val="24"/>
-        </w:rPr>
-        <w:t>A:  Hi! Ich bin neu hier. Erz</w:t>
-      </w:r>
-      <w:r>
-        <w:rPr>
-          <w:rFonts w:eastAsia="Arial" w:cs="Arial" w:ascii="Arial" w:hAnsi="Arial"/>
-          <w:sz w:val="24"/>
-          <w:szCs w:val="24"/>
-        </w:rPr>
-        <w:t>ä</w:t>
-      </w:r>
-      <w:r>
-        <w:rPr>
-          <w:rFonts w:eastAsia="Arial" w:cs="Arial" w:ascii="Arial" w:hAnsi="Arial"/>
-          <w:sz w:val="24"/>
-          <w:szCs w:val="24"/>
-        </w:rPr>
-        <w:t>hl mir von deiner Familie.</w:t>
-      </w:r>
-    </w:p>
-    <w:p>
-      <w:pPr>
-        <w:pStyle w:val="Normal"/>
-        <w:spacing w:before="80" w:after="80"/>
-        <w:rPr/>
-      </w:pPr>
-      <w:r>
-        <w:rPr>
-          <w:rFonts w:eastAsia="Arial" w:cs="Arial" w:ascii="Arial" w:hAnsi="Arial"/>
-          <w:sz w:val="24"/>
-          <w:szCs w:val="24"/>
-        </w:rPr>
-        <w:t>B:  Klar! Wir sind ______________ Personen. Meine Mutter heisst ______________.</w:t>
-      </w:r>
-    </w:p>
-    <w:p>
-      <w:pPr>
-        <w:pStyle w:val="Normal"/>
-        <w:spacing w:before="80" w:after="80"/>
-        <w:rPr/>
-      </w:pPr>
-      <w:r>
-        <w:rPr>
-          <w:rFonts w:eastAsia="Arial" w:cs="Arial" w:ascii="Arial" w:hAnsi="Arial"/>
-          <w:sz w:val="24"/>
-          <w:szCs w:val="24"/>
-        </w:rPr>
-        <w:t>A:  Hast du Geschwister?</w:t>
-      </w:r>
-    </w:p>
-    <w:p>
-      <w:pPr>
-        <w:pStyle w:val="Normal"/>
-        <w:spacing w:before="80" w:after="80"/>
-        <w:rPr/>
-      </w:pPr>
-      <w:r>
-        <w:rPr>
-          <w:rFonts w:eastAsia="Arial" w:cs="Arial" w:ascii="Arial" w:hAnsi="Arial"/>
-          <w:sz w:val="24"/>
-          <w:szCs w:val="24"/>
-        </w:rPr>
-        <w:t>B:  Ja, ich habe ______________. Er/Sie ist ______________ Jahre alt.</w:t>
-      </w:r>
-    </w:p>
-    <w:p>
-      <w:pPr>
-        <w:pStyle w:val="Normal"/>
-        <w:spacing w:before="80" w:after="80"/>
-        <w:rPr/>
-      </w:pPr>
-      <w:r>
-        <w:rPr>
-          <w:rFonts w:eastAsia="Arial" w:cs="Arial" w:ascii="Arial" w:hAnsi="Arial"/>
-          <w:sz w:val="24"/>
-          <w:szCs w:val="24"/>
-        </w:rPr>
-        <w:t>A:  Was machst du am Wochenende mit deiner Familie?</w:t>
-      </w:r>
-    </w:p>
-    <w:p>
-      <w:pPr>
-        <w:pStyle w:val="Normal"/>
-        <w:spacing w:before="80" w:after="80"/>
-        <w:rPr/>
-      </w:pPr>
-      <w:r>
-        <w:rPr>
-          <w:rFonts w:eastAsia="Arial" w:cs="Arial" w:ascii="Arial" w:hAnsi="Arial"/>
-          <w:sz w:val="24"/>
-          <w:szCs w:val="24"/>
-        </w:rPr>
-        <w:t>B:  Wir machen oft ______________________. Manchmal ______________________.</w:t>
-      </w:r>
-    </w:p>
-    <w:p>
-      <w:pPr>
-        <w:pStyle w:val="Normal"/>
-        <w:spacing w:before="80" w:after="80"/>
-        <w:rPr/>
-      </w:pPr>
-      <w:r>
-        <w:rPr>
-          <w:rFonts w:eastAsia="Arial" w:cs="Arial" w:ascii="Arial" w:hAnsi="Arial"/>
-          <w:sz w:val="24"/>
-          <w:szCs w:val="24"/>
-        </w:rPr>
-        <w:t>A:  Das klingt schoen!</w:t>
-      </w:r>
-    </w:p>
-    <w:p>
-      <w:pPr>
-        <w:pStyle w:val="Normal"/>
-        <w:rPr/>
-      </w:pPr>
-      <w:r>
-        <w:rPr/>
-      </w:r>
-    </w:p>
-    <w:p>
-      <w:pPr>
-        <w:pStyle w:val="Normal"/>
-        <w:spacing w:before="80" w:after="80"/>
-        <w:rPr/>
-      </w:pPr>
-      <w:r>
-        <w:rPr>
-          <w:rFonts w:eastAsia="Arial" w:cs="Arial" w:ascii="Arial" w:hAnsi="Arial"/>
-          <w:b/>
-          <w:bCs/>
-          <w:sz w:val="24"/>
-          <w:szCs w:val="24"/>
-        </w:rPr>
-        <w:t>Rollentausch! Uebt noch einmal.</w:t>
+        <w:t>Partnerinterview: Frage deine/n Partner/in.</w:t>
+      </w:r>
+    </w:p>
+    <w:p>
+      <w:pPr>
+        <w:pStyle w:val="Normal"/>
+        <w:rPr/>
+      </w:pPr>
+      <w:r>
+        <w:rPr/>
+      </w:r>
+    </w:p>
+    <w:p>
+      <w:pPr>
+        <w:pStyle w:val="Normal"/>
+        <w:spacing w:before="80" w:after="80"/>
+        <w:rPr/>
+      </w:pPr>
+      <w:r>
+        <w:rPr>
+          <w:rFonts w:eastAsia="Arial" w:cs="Arial" w:ascii="Arial" w:hAnsi="Arial"/>
+          <w:sz w:val="24"/>
+          <w:szCs w:val="24"/>
+        </w:rPr>
+        <w:t>1.  Wie viele Personen sind in deiner Familie?</w:t>
+      </w:r>
+    </w:p>
+    <w:p>
+      <w:pPr>
+        <w:pStyle w:val="Normal"/>
+        <w:pBdr>
+          <w:bottom w:val="single" w:sz="4" w:space="8" w:color="888888"/>
+        </w:pBdr>
+        <w:spacing w:before="240" w:after="0"/>
+        <w:rPr/>
+      </w:pPr>
+      <w:r>
+        <w:rPr/>
+      </w:r>
+    </w:p>
+    <w:p>
+      <w:pPr>
+        <w:pStyle w:val="Normal"/>
+        <w:rPr/>
+      </w:pPr>
+      <w:r>
+        <w:rPr/>
+      </w:r>
+    </w:p>
+    <w:p>
+      <w:pPr>
+        <w:pStyle w:val="Normal"/>
+        <w:spacing w:before="80" w:after="80"/>
+        <w:rPr/>
+      </w:pPr>
+      <w:r>
+        <w:rPr>
+          <w:rFonts w:eastAsia="Arial" w:cs="Arial" w:ascii="Arial" w:hAnsi="Arial"/>
+          <w:sz w:val="24"/>
+          <w:szCs w:val="24"/>
+        </w:rPr>
+        <w:t>2.  Was machen deine Eltern beruflich?</w:t>
+      </w:r>
+    </w:p>
+    <w:p>
+      <w:pPr>
+        <w:pStyle w:val="Normal"/>
+        <w:pBdr>
+          <w:bottom w:val="single" w:sz="4" w:space="8" w:color="888888"/>
+        </w:pBdr>
+        <w:spacing w:before="240" w:after="0"/>
+        <w:rPr/>
+      </w:pPr>
+      <w:r>
+        <w:rPr/>
+      </w:r>
+    </w:p>
+    <w:p>
+      <w:pPr>
+        <w:pStyle w:val="Normal"/>
+        <w:rPr/>
+      </w:pPr>
+      <w:r>
+        <w:rPr/>
+      </w:r>
+    </w:p>
+    <w:p>
+      <w:pPr>
+        <w:pStyle w:val="Normal"/>
+        <w:spacing w:before="80" w:after="80"/>
+        <w:rPr/>
+      </w:pPr>
+      <w:r>
+        <w:rPr>
+          <w:rFonts w:eastAsia="Arial" w:cs="Arial" w:ascii="Arial" w:hAnsi="Arial"/>
+          <w:sz w:val="24"/>
+          <w:szCs w:val="24"/>
+        </w:rPr>
+        <w:t>3.  Mit wem in deiner Familie verstehst du dich am besten? Warum?</w:t>
+      </w:r>
+    </w:p>
+    <w:p>
+      <w:pPr>
+        <w:pStyle w:val="Normal"/>
+        <w:pBdr>
+          <w:bottom w:val="single" w:sz="4" w:space="8" w:color="888888"/>
+        </w:pBdr>
+        <w:spacing w:before="240" w:after="0"/>
+        <w:rPr/>
+      </w:pPr>
+      <w:r>
+        <w:rPr/>
+      </w:r>
+    </w:p>
+    <w:p>
+      <w:pPr>
+        <w:pStyle w:val="Normal"/>
+        <w:rPr/>
+      </w:pPr>
+      <w:r>
+        <w:rPr/>
+      </w:r>
+    </w:p>
+    <w:p>
+      <w:pPr>
+        <w:pStyle w:val="Normal"/>
+        <w:spacing w:before="80" w:after="80"/>
+        <w:rPr/>
+      </w:pPr>
+      <w:r>
+        <w:rPr>
+          <w:rFonts w:eastAsia="Arial" w:cs="Arial" w:ascii="Arial" w:hAnsi="Arial"/>
+          <w:sz w:val="24"/>
+          <w:szCs w:val="24"/>
+        </w:rPr>
+        <w:t>4.  Was macht ihr am Wochenende zusammen?</w:t>
+      </w:r>
+    </w:p>
+    <w:p>
+      <w:pPr>
+        <w:pStyle w:val="Normal"/>
+        <w:pBdr>
+          <w:bottom w:val="single" w:sz="4" w:space="8" w:color="888888"/>
+        </w:pBdr>
+        <w:spacing w:before="240" w:after="0"/>
+        <w:rPr/>
+      </w:pPr>
+      <w:r>
+        <w:rPr/>
+      </w:r>
+    </w:p>
+    <w:p>
+      <w:pPr>
+        <w:pStyle w:val="Normal"/>
+        <w:rPr/>
+      </w:pPr>
+      <w:r>
+        <w:rPr/>
+      </w:r>
+    </w:p>
+    <w:p>
+      <w:pPr>
+        <w:pStyle w:val="Normal"/>
+        <w:spacing w:before="80" w:after="80"/>
+        <w:rPr/>
+      </w:pPr>
+      <w:r>
+        <w:rPr>
+          <w:rFonts w:eastAsia="Arial" w:cs="Arial" w:ascii="Arial" w:hAnsi="Arial"/>
+          <w:sz w:val="24"/>
+          <w:szCs w:val="24"/>
+        </w:rPr>
+        <w:t>5.  Streitest du manchmal? Mit wem und worum?</w:t>
+      </w:r>
+    </w:p>
+    <w:p>
+      <w:pPr>
+        <w:pStyle w:val="Normal"/>
+        <w:pBdr>
+          <w:bottom w:val="single" w:sz="4" w:space="8" w:color="888888"/>
+        </w:pBdr>
+        <w:spacing w:before="240" w:after="0"/>
+        <w:rPr/>
+      </w:pPr>
+      <w:r>
+        <w:rPr/>
       </w:r>
     </w:p>
     <w:p>
@@ -431,383 +783,7 @@
           <w:sz w:val="28"/>
           <w:szCs w:val="28"/>
         </w:rPr>
-        <w:t>Dialoggeruest 2: Verwandtenbesuch</w:t>
-      </w:r>
-    </w:p>
-    <w:p>
-      <w:pPr>
-        <w:pStyle w:val="Normal"/>
-        <w:rPr/>
-      </w:pPr>
-      <w:r>
-        <w:rPr/>
-      </w:r>
-    </w:p>
-    <w:p>
-      <w:pPr>
-        <w:pStyle w:val="Normal"/>
-        <w:spacing w:before="80" w:after="80"/>
-        <w:rPr/>
-      </w:pPr>
-      <w:r>
-        <w:rPr>
-          <w:rFonts w:eastAsia="Arial" w:cs="Arial" w:ascii="Arial" w:hAnsi="Arial"/>
-          <w:sz w:val="24"/>
-          <w:szCs w:val="24"/>
-        </w:rPr>
-        <w:t>A:  Wo warst du am Wochenende?</w:t>
-      </w:r>
-    </w:p>
-    <w:p>
-      <w:pPr>
-        <w:pStyle w:val="Normal"/>
-        <w:spacing w:before="80" w:after="80"/>
-        <w:rPr/>
-      </w:pPr>
-      <w:r>
-        <w:rPr>
-          <w:rFonts w:eastAsia="Arial" w:cs="Arial" w:ascii="Arial" w:hAnsi="Arial"/>
-          <w:sz w:val="24"/>
-          <w:szCs w:val="24"/>
-        </w:rPr>
-        <w:t>B:  Ich war bei ______________________.</w:t>
-      </w:r>
-    </w:p>
-    <w:p>
-      <w:pPr>
-        <w:pStyle w:val="Normal"/>
-        <w:spacing w:before="80" w:after="80"/>
-        <w:rPr/>
-      </w:pPr>
-      <w:r>
-        <w:rPr>
-          <w:rFonts w:eastAsia="Arial" w:cs="Arial" w:ascii="Arial" w:hAnsi="Arial"/>
-          <w:sz w:val="24"/>
-          <w:szCs w:val="24"/>
-        </w:rPr>
-        <w:t>A:  Was habt ihr gemacht?</w:t>
-      </w:r>
-    </w:p>
-    <w:p>
-      <w:pPr>
-        <w:pStyle w:val="Normal"/>
-        <w:spacing w:before="80" w:after="80"/>
-        <w:rPr/>
-      </w:pPr>
-      <w:r>
-        <w:rPr>
-          <w:rFonts w:eastAsia="Arial" w:cs="Arial" w:ascii="Arial" w:hAnsi="Arial"/>
-          <w:sz w:val="24"/>
-          <w:szCs w:val="24"/>
-        </w:rPr>
-        <w:t>B:  Wir haben ______________________ und ______________________.</w:t>
-      </w:r>
-    </w:p>
-    <w:p>
-      <w:pPr>
-        <w:pStyle w:val="Normal"/>
-        <w:spacing w:before="80" w:after="80"/>
-        <w:rPr/>
-      </w:pPr>
-      <w:r>
-        <w:rPr>
-          <w:rFonts w:eastAsia="Arial" w:cs="Arial" w:ascii="Arial" w:hAnsi="Arial"/>
-          <w:sz w:val="24"/>
-          <w:szCs w:val="24"/>
-        </w:rPr>
-        <w:t>A:  Hat es dir gefallen?</w:t>
-      </w:r>
-    </w:p>
-    <w:p>
-      <w:pPr>
-        <w:pStyle w:val="Normal"/>
-        <w:spacing w:before="80" w:after="80"/>
-        <w:rPr/>
-      </w:pPr>
-      <w:r>
-        <w:rPr>
-          <w:rFonts w:eastAsia="Arial" w:cs="Arial" w:ascii="Arial" w:hAnsi="Arial"/>
-          <w:sz w:val="24"/>
-          <w:szCs w:val="24"/>
-        </w:rPr>
-        <w:t>B:  Ja, sehr! / Nicht so, weil ______________________.</w:t>
-      </w:r>
-    </w:p>
-    <w:p>
-      <w:pPr>
-        <w:pStyle w:val="Normal"/>
-        <w:rPr/>
-      </w:pPr>
-      <w:r>
-        <w:rPr/>
-      </w:r>
-    </w:p>
-    <w:p>
-      <w:pPr>
-        <w:pStyle w:val="Normal"/>
-        <w:spacing w:before="80" w:after="80"/>
-        <w:rPr/>
-      </w:pPr>
-      <w:r>
-        <w:rPr>
-          <w:rFonts w:eastAsia="Arial" w:cs="Arial" w:ascii="Arial" w:hAnsi="Arial"/>
-          <w:b/>
-          <w:bCs/>
-          <w:sz w:val="24"/>
-          <w:szCs w:val="24"/>
-        </w:rPr>
-        <w:t>Rollentausch!</w:t>
-      </w:r>
-    </w:p>
-    <w:p>
-      <w:pPr>
-        <w:pStyle w:val="Normal"/>
-        <w:rPr/>
-      </w:pPr>
-      <w:r>
-        <w:rPr/>
-      </w:r>
-    </w:p>
-    <w:p>
-      <w:pPr>
-        <w:pStyle w:val="Normal"/>
-        <w:rPr/>
-      </w:pPr>
-      <w:r>
-        <w:rPr/>
-      </w:r>
-      <w:r>
-        <w:br w:type="page"/>
-      </w:r>
-    </w:p>
-    <w:p>
-      <w:pPr>
-        <w:pStyle w:val="Normal"/>
-        <w:spacing w:before="0" w:after="80"/>
-        <w:rPr/>
-      </w:pPr>
-      <w:r>
-        <w:rPr>
-          <w:rFonts w:eastAsia="Arial" w:cs="Arial" w:ascii="Arial" w:hAnsi="Arial"/>
-          <w:b/>
-          <w:bCs/>
-          <w:color w:val="1F4E79"/>
-          <w:sz w:val="28"/>
-          <w:szCs w:val="28"/>
-        </w:rPr>
-        <w:t>Partnerinterview: Frage deine/n Partner/in.</w:t>
-      </w:r>
-    </w:p>
-    <w:p>
-      <w:pPr>
-        <w:pStyle w:val="Normal"/>
-        <w:rPr/>
-      </w:pPr>
-      <w:r>
-        <w:rPr/>
-      </w:r>
-    </w:p>
-    <w:p>
-      <w:pPr>
-        <w:pStyle w:val="Normal"/>
-        <w:spacing w:before="80" w:after="80"/>
-        <w:rPr/>
-      </w:pPr>
-      <w:r>
-        <w:rPr>
-          <w:rFonts w:eastAsia="Arial" w:cs="Arial" w:ascii="Arial" w:hAnsi="Arial"/>
-          <w:sz w:val="24"/>
-          <w:szCs w:val="24"/>
-        </w:rPr>
-        <w:t>1.  Wie viele Personen sind in deiner Familie?</w:t>
-      </w:r>
-    </w:p>
-    <w:p>
-      <w:pPr>
-        <w:pStyle w:val="Normal"/>
-        <w:pBdr>
-          <w:bottom w:val="single" w:sz="4" w:space="8" w:color="888888"/>
-        </w:pBdr>
-        <w:spacing w:before="240" w:after="0"/>
-        <w:rPr/>
-      </w:pPr>
-      <w:r>
-        <w:rPr/>
-      </w:r>
-    </w:p>
-    <w:p>
-      <w:pPr>
-        <w:pStyle w:val="Normal"/>
-        <w:rPr/>
-      </w:pPr>
-      <w:r>
-        <w:rPr/>
-      </w:r>
-    </w:p>
-    <w:p>
-      <w:pPr>
-        <w:pStyle w:val="Normal"/>
-        <w:spacing w:before="80" w:after="80"/>
-        <w:rPr/>
-      </w:pPr>
-      <w:r>
-        <w:rPr>
-          <w:rFonts w:eastAsia="Arial" w:cs="Arial" w:ascii="Arial" w:hAnsi="Arial"/>
-          <w:sz w:val="24"/>
-          <w:szCs w:val="24"/>
-        </w:rPr>
-        <w:t>2.  Was machen deine Eltern beruflich?</w:t>
-      </w:r>
-    </w:p>
-    <w:p>
-      <w:pPr>
-        <w:pStyle w:val="Normal"/>
-        <w:pBdr>
-          <w:bottom w:val="single" w:sz="4" w:space="8" w:color="888888"/>
-        </w:pBdr>
-        <w:spacing w:before="240" w:after="0"/>
-        <w:rPr/>
-      </w:pPr>
-      <w:r>
-        <w:rPr/>
-      </w:r>
-    </w:p>
-    <w:p>
-      <w:pPr>
-        <w:pStyle w:val="Normal"/>
-        <w:rPr/>
-      </w:pPr>
-      <w:r>
-        <w:rPr/>
-      </w:r>
-    </w:p>
-    <w:p>
-      <w:pPr>
-        <w:pStyle w:val="Normal"/>
-        <w:spacing w:before="80" w:after="80"/>
-        <w:rPr/>
-      </w:pPr>
-      <w:r>
-        <w:rPr>
-          <w:rFonts w:eastAsia="Arial" w:cs="Arial" w:ascii="Arial" w:hAnsi="Arial"/>
-          <w:sz w:val="24"/>
-          <w:szCs w:val="24"/>
-        </w:rPr>
-        <w:t>3.  Mit wem in deiner Familie verstehst du dich am besten? Warum?</w:t>
-      </w:r>
-    </w:p>
-    <w:p>
-      <w:pPr>
-        <w:pStyle w:val="Normal"/>
-        <w:pBdr>
-          <w:bottom w:val="single" w:sz="4" w:space="8" w:color="888888"/>
-        </w:pBdr>
-        <w:spacing w:before="240" w:after="0"/>
-        <w:rPr/>
-      </w:pPr>
-      <w:r>
-        <w:rPr/>
-      </w:r>
-    </w:p>
-    <w:p>
-      <w:pPr>
-        <w:pStyle w:val="Normal"/>
-        <w:rPr/>
-      </w:pPr>
-      <w:r>
-        <w:rPr/>
-      </w:r>
-    </w:p>
-    <w:p>
-      <w:pPr>
-        <w:pStyle w:val="Normal"/>
-        <w:spacing w:before="80" w:after="80"/>
-        <w:rPr/>
-      </w:pPr>
-      <w:r>
-        <w:rPr>
-          <w:rFonts w:eastAsia="Arial" w:cs="Arial" w:ascii="Arial" w:hAnsi="Arial"/>
-          <w:sz w:val="24"/>
-          <w:szCs w:val="24"/>
-        </w:rPr>
-        <w:t>4.  Was macht ihr am Wochenende zusammen?</w:t>
-      </w:r>
-    </w:p>
-    <w:p>
-      <w:pPr>
-        <w:pStyle w:val="Normal"/>
-        <w:pBdr>
-          <w:bottom w:val="single" w:sz="4" w:space="8" w:color="888888"/>
-        </w:pBdr>
-        <w:spacing w:before="240" w:after="0"/>
-        <w:rPr/>
-      </w:pPr>
-      <w:r>
-        <w:rPr/>
-      </w:r>
-    </w:p>
-    <w:p>
-      <w:pPr>
-        <w:pStyle w:val="Normal"/>
-        <w:rPr/>
-      </w:pPr>
-      <w:r>
-        <w:rPr/>
-      </w:r>
-    </w:p>
-    <w:p>
-      <w:pPr>
-        <w:pStyle w:val="Normal"/>
-        <w:spacing w:before="80" w:after="80"/>
-        <w:rPr/>
-      </w:pPr>
-      <w:r>
-        <w:rPr>
-          <w:rFonts w:eastAsia="Arial" w:cs="Arial" w:ascii="Arial" w:hAnsi="Arial"/>
-          <w:sz w:val="24"/>
-          <w:szCs w:val="24"/>
-        </w:rPr>
-        <w:t>5.  Streitest du manchmal? Mit wem und worum?</w:t>
-      </w:r>
-    </w:p>
-    <w:p>
-      <w:pPr>
-        <w:pStyle w:val="Normal"/>
-        <w:pBdr>
-          <w:bottom w:val="single" w:sz="4" w:space="8" w:color="888888"/>
-        </w:pBdr>
-        <w:spacing w:before="240" w:after="0"/>
-        <w:rPr/>
-      </w:pPr>
-      <w:r>
-        <w:rPr/>
-      </w:r>
-    </w:p>
-    <w:p>
-      <w:pPr>
-        <w:pStyle w:val="Normal"/>
-        <w:rPr/>
-      </w:pPr>
-      <w:r>
-        <w:rPr/>
-      </w:r>
-    </w:p>
-    <w:p>
-      <w:pPr>
-        <w:pStyle w:val="Normal"/>
-        <w:spacing w:before="200" w:after="80"/>
-        <w:rPr/>
-      </w:pPr>
-      <w:r>
-        <w:rPr>
-          <w:rFonts w:eastAsia="Arial" w:cs="Arial" w:ascii="Arial" w:hAnsi="Arial"/>
-          <w:b/>
-          <w:bCs/>
-          <w:color w:val="1F4E79"/>
-          <w:sz w:val="28"/>
-          <w:szCs w:val="28"/>
-        </w:rPr>
-        <w:t>Gruppenspiel: Familienraetsel</w:t>
+        <w:t>Gruppenspiel: Familienrätsel</w:t>
       </w:r>
     </w:p>
     <w:p>
@@ -863,14 +839,14 @@
         </w:tblCellMar>
       </w:tblPr>
       <w:tblGrid>
-        <w:gridCol w:w="2999"/>
-        <w:gridCol w:w="6001"/>
+        <w:gridCol w:w="2998"/>
+        <w:gridCol w:w="6002"/>
       </w:tblGrid>
       <w:tr>
         <w:trPr/>
         <w:tc>
           <w:tcPr>
-            <w:tcW w:w="2999" w:type="dxa"/>
+            <w:tcW w:w="2998" w:type="dxa"/>
             <w:tcBorders>
               <w:top w:val="single" w:sz="4" w:space="0" w:color="000000"/>
               <w:start w:val="single" w:sz="4" w:space="0" w:color="000000"/>
@@ -898,7 +874,7 @@
         </w:tc>
         <w:tc>
           <w:tcPr>
-            <w:tcW w:w="6001" w:type="dxa"/>
+            <w:tcW w:w="6002" w:type="dxa"/>
             <w:tcBorders>
               <w:top w:val="single" w:sz="4" w:space="0" w:color="000000"/>
               <w:start w:val="single" w:sz="4" w:space="0" w:color="000000"/>
@@ -920,7 +896,7 @@
                 <w:sz w:val="24"/>
                 <w:szCs w:val="24"/>
               </w:rPr>
-              <w:t>Beschreibung &amp; Loesung</w:t>
+              <w:t>Beschreibung &amp; Lösung</w:t>
             </w:r>
           </w:p>
         </w:tc>
@@ -929,7 +905,7 @@
         <w:trPr/>
         <w:tc>
           <w:tcPr>
-            <w:tcW w:w="2999" w:type="dxa"/>
+            <w:tcW w:w="2998" w:type="dxa"/>
             <w:tcBorders>
               <w:top w:val="single" w:sz="4" w:space="0" w:color="000000"/>
               <w:start w:val="single" w:sz="4" w:space="0" w:color="000000"/>
@@ -954,7 +930,7 @@
         </w:tc>
         <w:tc>
           <w:tcPr>
-            <w:tcW w:w="6001" w:type="dxa"/>
+            <w:tcW w:w="6002" w:type="dxa"/>
             <w:tcBorders>
               <w:top w:val="single" w:sz="4" w:space="0" w:color="000000"/>
               <w:start w:val="single" w:sz="4" w:space="0" w:color="000000"/>
@@ -982,7 +958,7 @@
         <w:trPr/>
         <w:tc>
           <w:tcPr>
-            <w:tcW w:w="2999" w:type="dxa"/>
+            <w:tcW w:w="2998" w:type="dxa"/>
             <w:tcBorders>
               <w:top w:val="single" w:sz="4" w:space="0" w:color="000000"/>
               <w:start w:val="single" w:sz="4" w:space="0" w:color="000000"/>
@@ -1007,7 +983,7 @@
         </w:tc>
         <w:tc>
           <w:tcPr>
-            <w:tcW w:w="6001" w:type="dxa"/>
+            <w:tcW w:w="6002" w:type="dxa"/>
             <w:tcBorders>
               <w:top w:val="single" w:sz="4" w:space="0" w:color="000000"/>
               <w:start w:val="single" w:sz="4" w:space="0" w:color="000000"/>
@@ -1035,7 +1011,7 @@
         <w:trPr/>
         <w:tc>
           <w:tcPr>
-            <w:tcW w:w="2999" w:type="dxa"/>
+            <w:tcW w:w="2998" w:type="dxa"/>
             <w:tcBorders>
               <w:top w:val="single" w:sz="4" w:space="0" w:color="000000"/>
               <w:start w:val="single" w:sz="4" w:space="0" w:color="000000"/>
@@ -1060,7 +1036,7 @@
         </w:tc>
         <w:tc>
           <w:tcPr>
-            <w:tcW w:w="6001" w:type="dxa"/>
+            <w:tcW w:w="6002" w:type="dxa"/>
             <w:tcBorders>
               <w:top w:val="single" w:sz="4" w:space="0" w:color="000000"/>
               <w:start w:val="single" w:sz="4" w:space="0" w:color="000000"/>
@@ -1298,7 +1274,7 @@
         <w:sz w:val="18"/>
         <w:szCs w:val="18"/>
       </w:rPr>
-      <w:t>A2 Kinder -- Familie &amp; Alltag -- Familie erzaehlen</w:t>
+      <w:t>A2 Kinder -- Familie &amp; Alltag -- Familie erzählen</w:t>
     </w:r>
   </w:p>
 </w:hdr>
@@ -1321,7 +1297,7 @@
         <w:sz w:val="18"/>
         <w:szCs w:val="18"/>
       </w:rPr>
-      <w:t>A2 Kinder -- Familie &amp; Alltag -- Familie erzaehlen</w:t>
+      <w:t>A2 Kinder -- Familie &amp; Alltag -- Familie erzählen</w:t>
     </w:r>
   </w:p>
 </w:hdr>
@@ -1347,6 +1323,7 @@
     <w:qFormat/>
     <w:pPr>
       <w:widowControl/>
+      <w:suppressAutoHyphens w:val="true"/>
       <w:bidi w:val="0"/>
       <w:spacing w:before="0" w:after="0"/>
       <w:jc w:val="start"/>
@@ -1362,7 +1339,7 @@
   </w:style>
   <w:style w:type="paragraph" w:styleId="Heading1">
     <w:name w:val="heading 1"/>
-    <w:basedOn w:val="berschrift"/>
+    <w:basedOn w:val="berschriftuser"/>
     <w:qFormat/>
     <w:pPr/>
     <w:rPr>
@@ -1373,7 +1350,7 @@
   </w:style>
   <w:style w:type="paragraph" w:styleId="Heading2">
     <w:name w:val="heading 2"/>
-    <w:basedOn w:val="berschrift"/>
+    <w:basedOn w:val="berschriftuser"/>
     <w:qFormat/>
     <w:pPr/>
     <w:rPr>
@@ -1384,7 +1361,7 @@
   </w:style>
   <w:style w:type="paragraph" w:styleId="Heading3">
     <w:name w:val="heading 3"/>
-    <w:basedOn w:val="berschrift"/>
+    <w:basedOn w:val="berschriftuser"/>
     <w:qFormat/>
     <w:pPr/>
     <w:rPr>
@@ -1395,7 +1372,7 @@
   </w:style>
   <w:style w:type="paragraph" w:styleId="Heading4">
     <w:name w:val="heading 4"/>
-    <w:basedOn w:val="berschrift"/>
+    <w:basedOn w:val="berschriftuser"/>
     <w:qFormat/>
     <w:pPr/>
     <w:rPr>
@@ -1406,7 +1383,7 @@
   </w:style>
   <w:style w:type="paragraph" w:styleId="Heading5">
     <w:name w:val="heading 5"/>
-    <w:basedOn w:val="berschrift"/>
+    <w:basedOn w:val="berschriftuser"/>
     <w:qFormat/>
     <w:pPr/>
     <w:rPr>
@@ -1415,7 +1392,7 @@
   </w:style>
   <w:style w:type="paragraph" w:styleId="Heading6">
     <w:name w:val="heading 6"/>
-    <w:basedOn w:val="berschrift"/>
+    <w:basedOn w:val="berschriftuser"/>
     <w:qFormat/>
     <w:pPr/>
     <w:rPr>
@@ -1431,11 +1408,18 @@
       <w:u w:val="single"/>
     </w:rPr>
   </w:style>
-  <w:style w:type="character" w:styleId="Funotenzeichen">
-    <w:name w:val="Fußnotenzeichen"/>
+  <w:style w:type="character" w:styleId="Funotenzeichenuser">
+    <w:name w:val="Fußnotenzeichen (user)"/>
     <w:uiPriority w:val="99"/>
     <w:semiHidden/>
     <w:unhideWhenUsed/>
+    <w:qFormat/>
+    <w:rPr>
+      <w:vertAlign w:val="superscript"/>
+    </w:rPr>
+  </w:style>
+  <w:style w:type="character" w:styleId="Funotenzeichen">
+    <w:name w:val="Fußnotenzeichen"/>
     <w:qFormat/>
     <w:rPr>
       <w:vertAlign w:val="superscript"/>
@@ -1458,11 +1442,18 @@
       <w:szCs w:val="20"/>
     </w:rPr>
   </w:style>
-  <w:style w:type="character" w:styleId="Endnotenzeichen">
-    <w:name w:val="Endnotenzeichen"/>
+  <w:style w:type="character" w:styleId="Endnotenzeichenuser">
+    <w:name w:val="Endnotenzeichen (user)"/>
     <w:uiPriority w:val="99"/>
     <w:semiHidden/>
     <w:unhideWhenUsed/>
+    <w:qFormat/>
+    <w:rPr>
+      <w:vertAlign w:val="superscript"/>
+    </w:rPr>
+  </w:style>
+  <w:style w:type="character" w:styleId="Endnotenzeichen">
+    <w:name w:val="Endnotenzeichen"/>
     <w:qFormat/>
     <w:rPr>
       <w:vertAlign w:val="superscript"/>
@@ -1544,9 +1535,35 @@
       <w:rFonts w:cs="Lucida Sans"/>
     </w:rPr>
   </w:style>
+  <w:style w:type="paragraph" w:styleId="berschriftuser">
+    <w:name w:val="Überschrift (user)"/>
+    <w:basedOn w:val="Normal"/>
+    <w:next w:val="BodyText"/>
+    <w:qFormat/>
+    <w:pPr>
+      <w:keepNext w:val="true"/>
+      <w:spacing w:before="240" w:after="120"/>
+    </w:pPr>
+    <w:rPr>
+      <w:rFonts w:ascii="Liberation Sans" w:hAnsi="Liberation Sans" w:eastAsia="Microsoft YaHei" w:cs="Lucida Sans"/>
+      <w:sz w:val="28"/>
+      <w:szCs w:val="28"/>
+    </w:rPr>
+  </w:style>
+  <w:style w:type="paragraph" w:styleId="Verzeichnisuser">
+    <w:name w:val="Verzeichnis (user)"/>
+    <w:basedOn w:val="Normal"/>
+    <w:qFormat/>
+    <w:pPr>
+      <w:suppressLineNumbers/>
+    </w:pPr>
+    <w:rPr>
+      <w:rFonts w:cs="Lucida Sans"/>
+    </w:rPr>
+  </w:style>
   <w:style w:type="paragraph" w:styleId="Title">
     <w:name w:val="Title"/>
-    <w:basedOn w:val="berschrift"/>
+    <w:basedOn w:val="berschriftuser"/>
     <w:qFormat/>
     <w:pPr/>
     <w:rPr>
@@ -1559,6 +1576,7 @@
     <w:qFormat/>
     <w:pPr>
       <w:widowControl/>
+      <w:suppressAutoHyphens w:val="true"/>
       <w:bidi w:val="0"/>
       <w:spacing w:before="0" w:after="0"/>
       <w:jc w:val="start"/>
@@ -1579,6 +1597,7 @@
     <w:qFormat/>
     <w:pPr>
       <w:widowControl/>
+      <w:suppressAutoHyphens w:val="true"/>
       <w:bidi w:val="0"/>
       <w:spacing w:before="0" w:after="0"/>
       <w:jc w:val="start"/>
@@ -1622,6 +1641,13 @@
       <w:szCs w:val="20"/>
     </w:rPr>
   </w:style>
+  <w:style w:type="paragraph" w:styleId="Kopf-Fuzeileuser">
+    <w:name w:val="Kopf-/Fußzeile (user)"/>
+    <w:basedOn w:val="Normal"/>
+    <w:qFormat/>
+    <w:pPr/>
+    <w:rPr/>
+  </w:style>
   <w:style w:type="paragraph" w:styleId="Kopf-Fuzeile">
     <w:name w:val="Kopf-/Fußzeile"/>
     <w:basedOn w:val="Normal"/>
@@ -1631,13 +1657,13 @@
   </w:style>
   <w:style w:type="paragraph" w:styleId="Header">
     <w:name w:val="header"/>
-    <w:basedOn w:val="Kopf-Fuzeile"/>
+    <w:basedOn w:val="Kopf-Fuzeileuser"/>
     <w:pPr/>
     <w:rPr/>
   </w:style>
   <w:style w:type="paragraph" w:styleId="Footer">
     <w:name w:val="footer"/>
-    <w:basedOn w:val="Kopf-Fuzeile"/>
+    <w:basedOn w:val="Kopf-Fuzeileuser"/>
     <w:pPr/>
     <w:rPr/>
   </w:style>

</xml_diff>